<commit_message>
Adding new statement template
</commit_message>
<xml_diff>
--- a/includes/docgen/templates/statement_template.docx
+++ b/includes/docgen/templates/statement_template.docx
@@ -20,7 +20,7 @@
     <w:tbl>
       <w:tblPr>
         <w:tblStyle w:val="Table1"/>
-        <w:tblW w:w="11520.0" w:type="dxa"/>
+        <w:tblW w:w="11535.0" w:type="dxa"/>
         <w:jc w:val="left"/>
         <w:tblBorders>
           <w:top w:color="000000" w:space="0" w:sz="4" w:val="single"/>
@@ -38,14 +38,14 @@
         <w:gridCol w:w="1920"/>
         <w:gridCol w:w="1920"/>
         <w:gridCol w:w="1920"/>
-        <w:gridCol w:w="1920"/>
+        <w:gridCol w:w="1935"/>
         <w:tblGridChange w:id="0">
           <w:tblGrid>
             <w:gridCol w:w="3840"/>
             <w:gridCol w:w="1920"/>
             <w:gridCol w:w="1920"/>
             <w:gridCol w:w="1920"/>
-            <w:gridCol w:w="1920"/>
+            <w:gridCol w:w="1935"/>
           </w:tblGrid>
         </w:tblGridChange>
       </w:tblGrid>
@@ -59,55 +59,108 @@
           <w:tcPr>
             <w:gridSpan w:val="5"/>
             <w:tcBorders>
-              <w:top w:color="000000" w:space="0" w:sz="4" w:val="single"/>
-              <w:left w:color="000000" w:space="0" w:sz="4" w:val="single"/>
-              <w:bottom w:color="000000" w:space="0" w:sz="4" w:val="single"/>
+              <w:top w:color="000000" w:space="0" w:sz="0" w:val="nil"/>
+              <w:left w:color="000000" w:space="0" w:sz="0" w:val="nil"/>
+              <w:bottom w:color="000000" w:space="0" w:sz="0" w:val="nil"/>
               <w:right w:color="000000" w:space="0" w:sz="4" w:val="single"/>
             </w:tcBorders>
             <w:vAlign w:val="center"/>
           </w:tcPr>
           <w:p>
             <w:pPr>
+              <w:spacing w:line="276" w:lineRule="auto"/>
               <w:jc w:val="center"/>
               <w:rPr>
-                <w:rFonts w:ascii="Arial" w:cs="Arial" w:eastAsia="Arial" w:hAnsi="Arial"/>
                 <w:b w:val="1"/>
                 <w:bCs w:val="1"/>
+                <w:i w:val="1"/>
+                <w:iCs w:val="1"/>
                 <w:sz w:val="36"/>
                 <w:szCs w:val="36"/>
               </w:rPr>
             </w:pPr>
             <w:r>
               <w:rPr>
-                <w:rFonts w:ascii="Arial" w:cs="Arial" w:eastAsia="Arial" w:hAnsi="Arial"/>
                 <w:b w:val="1"/>
                 <w:bCs w:val="1"/>
+                <w:i w:val="1"/>
+                <w:iCs w:val="1"/>
                 <w:sz w:val="36"/>
                 <w:szCs w:val="36"/>
                 <w:rtl w:val="0"/>
               </w:rPr>
-              <w:t xml:space="preserve">${</w:t>
+              <w:t xml:space="preserve">Upper St. Clair Tennis Development Program, Inc.</w:t>
             </w:r>
+          </w:p>
+          <w:p>
+            <w:pPr>
+              <w:jc w:val="center"/>
+              <w:rPr>
+                <w:b w:val="1"/>
+                <w:bCs w:val="1"/>
+                <w:sz w:val="26"/>
+                <w:szCs w:val="26"/>
+              </w:rPr>
+            </w:pPr>
             <w:r>
               <w:rPr>
                 <w:b w:val="1"/>
                 <w:bCs w:val="1"/>
-                <w:sz w:val="36"/>
-                <w:szCs w:val="36"/>
+                <w:sz w:val="26"/>
+                <w:szCs w:val="26"/>
                 <w:rtl w:val="0"/>
               </w:rPr>
-              <w:t xml:space="preserve">statement</w:t>
+              <w:t xml:space="preserve">37 McMurray Road, Building #1, Suite LL1, Pittsburgh, PA 15241     (412) 831-2630</w:t>
+            </w:r>
+          </w:p>
+          <w:p>
+            <w:pPr>
+              <w:spacing w:line="360" w:lineRule="auto"/>
+              <w:jc w:val="center"/>
+              <w:rPr>
+                <w:b w:val="1"/>
+                <w:bCs w:val="1"/>
+                <w:sz w:val="26"/>
+                <w:szCs w:val="26"/>
+              </w:rPr>
+            </w:pPr>
+            <w:r>
+              <w:pict>
+                <v:rect style="width:0.0pt;height:1.5pt" o:hr="t" o:hrstd="t" o:hralign="center" fillcolor="#A0A0A0" stroked="f"/>
+              </w:pict>
             </w:r>
             <w:r>
               <w:rPr>
-                <w:rFonts w:ascii="Arial" w:cs="Arial" w:eastAsia="Arial" w:hAnsi="Arial"/>
+                <w:rtl w:val="0"/>
+              </w:rPr>
+            </w:r>
+          </w:p>
+          <w:p>
+            <w:pPr>
+              <w:jc w:val="center"/>
+              <w:rPr>
                 <w:b w:val="1"/>
                 <w:bCs w:val="1"/>
-                <w:sz w:val="36"/>
-                <w:szCs w:val="36"/>
+                <w:sz w:val="30"/>
+                <w:szCs w:val="30"/>
+                <w:u w:val="single"/>
+              </w:rPr>
+            </w:pPr>
+            <w:r>
+              <w:rPr>
+                <w:b w:val="1"/>
+                <w:bCs w:val="1"/>
+                <w:sz w:val="34"/>
+                <w:szCs w:val="34"/>
+                <w:u w:val="single"/>
                 <w:rtl w:val="0"/>
               </w:rPr>
-              <w:t xml:space="preserve">_title}</w:t>
+              <w:t xml:space="preserve">Statement</w:t>
+            </w:r>
+            <w:r>
+              <w:rPr>
+                <w:rtl w:val="0"/>
+              </w:rPr>
             </w:r>
           </w:p>
         </w:tc>
@@ -123,7 +176,7 @@
             <w:gridSpan w:val="5"/>
             <w:vMerge w:val="restart"/>
             <w:tcBorders>
-              <w:top w:color="000000" w:space="0" w:sz="4" w:val="single"/>
+              <w:top w:color="000000" w:space="0" w:sz="0" w:val="nil"/>
               <w:left w:color="000000" w:space="0" w:sz="0" w:val="nil"/>
               <w:bottom w:color="000000" w:space="0" w:sz="0" w:val="nil"/>
               <w:right w:color="000000" w:space="0" w:sz="0" w:val="nil"/>
@@ -148,7 +201,7 @@
           <w:tbl>
             <w:tblPr>
               <w:tblStyle w:val="Table2"/>
-              <w:tblW w:w="11280.0" w:type="dxa"/>
+              <w:tblW w:w="11265.0" w:type="dxa"/>
               <w:jc w:val="left"/>
               <w:tblBorders>
                 <w:top w:color="000000" w:space="0" w:sz="8" w:val="single"/>
@@ -162,12 +215,20 @@
               <w:tblLook w:val="0600"/>
             </w:tblPr>
             <w:tblGrid>
-              <w:gridCol w:w="1440"/>
-              <w:gridCol w:w="9840"/>
+              <w:gridCol w:w="1350"/>
+              <w:gridCol w:w="3075"/>
+              <w:gridCol w:w="945"/>
+              <w:gridCol w:w="1245"/>
+              <w:gridCol w:w="1980"/>
+              <w:gridCol w:w="2670"/>
               <w:tblGridChange w:id="0">
                 <w:tblGrid>
-                  <w:gridCol w:w="1440"/>
-                  <w:gridCol w:w="9840"/>
+                  <w:gridCol w:w="1350"/>
+                  <w:gridCol w:w="3075"/>
+                  <w:gridCol w:w="945"/>
+                  <w:gridCol w:w="1245"/>
+                  <w:gridCol w:w="1980"/>
+                  <w:gridCol w:w="2670"/>
                 </w:tblGrid>
               </w:tblGridChange>
             </w:tblGrid>
@@ -220,7 +281,7 @@
                       <w:bCs w:val="1"/>
                       <w:rtl w:val="0"/>
                     </w:rPr>
-                    <w:t xml:space="preserve">${label}</w:t>
+                    <w:t xml:space="preserve">Family ID:</w:t>
                   </w:r>
                 </w:p>
               </w:tc>
@@ -263,7 +324,721 @@
                     <w:rPr>
                       <w:rtl w:val="0"/>
                     </w:rPr>
-                    <w:t xml:space="preserve">${value}</w:t>
+                    <w:t xml:space="preserve">${family_id}</w:t>
+                  </w:r>
+                </w:p>
+              </w:tc>
+              <w:tc>
+                <w:tcPr>
+                  <w:tcBorders>
+                    <w:top w:color="000000" w:space="0" w:sz="0" w:val="nil"/>
+                    <w:left w:color="000000" w:space="0" w:sz="0" w:val="nil"/>
+                    <w:bottom w:color="000000" w:space="0" w:sz="0" w:val="nil"/>
+                    <w:right w:color="000000" w:space="0" w:sz="0" w:val="nil"/>
+                  </w:tcBorders>
+                  <w:shd w:fill="auto" w:val="clear"/>
+                  <w:tcMar>
+                    <w:top w:w="72.0" w:type="dxa"/>
+                    <w:left w:w="72.0" w:type="dxa"/>
+                    <w:bottom w:w="72.0" w:type="dxa"/>
+                    <w:right w:w="72.0" w:type="dxa"/>
+                  </w:tcMar>
+                  <w:vAlign w:val="top"/>
+                </w:tcPr>
+                <w:p>
+                  <w:pPr>
+                    <w:keepNext w:val="0"/>
+                    <w:keepLines w:val="0"/>
+                    <w:pageBreakBefore w:val="0"/>
+                    <w:widowControl w:val="0"/>
+                    <w:pBdr>
+                      <w:top w:space="0" w:sz="0" w:val="nil"/>
+                      <w:left w:space="0" w:sz="0" w:val="nil"/>
+                      <w:bottom w:space="0" w:sz="0" w:val="nil"/>
+                      <w:right w:space="0" w:sz="0" w:val="nil"/>
+                      <w:between w:space="0" w:sz="0" w:val="nil"/>
+                    </w:pBdr>
+                    <w:shd w:fill="auto" w:val="clear"/>
+                    <w:spacing w:after="0" w:before="0" w:line="240" w:lineRule="auto"/>
+                    <w:ind w:left="0" w:right="0" w:firstLine="0"/>
+                    <w:rPr/>
+                  </w:pPr>
+                  <w:r>
+                    <w:rPr>
+                      <w:rtl w:val="0"/>
+                    </w:rPr>
+                  </w:r>
+                </w:p>
+              </w:tc>
+              <w:tc>
+                <w:tcPr>
+                  <w:tcBorders>
+                    <w:top w:color="000000" w:space="0" w:sz="0" w:val="nil"/>
+                    <w:left w:color="000000" w:space="0" w:sz="0" w:val="nil"/>
+                    <w:bottom w:color="000000" w:space="0" w:sz="0" w:val="nil"/>
+                    <w:right w:color="000000" w:space="0" w:sz="0" w:val="nil"/>
+                  </w:tcBorders>
+                  <w:shd w:fill="auto" w:val="clear"/>
+                  <w:tcMar>
+                    <w:top w:w="72.0" w:type="dxa"/>
+                    <w:left w:w="72.0" w:type="dxa"/>
+                    <w:bottom w:w="72.0" w:type="dxa"/>
+                    <w:right w:w="72.0" w:type="dxa"/>
+                  </w:tcMar>
+                  <w:vAlign w:val="top"/>
+                </w:tcPr>
+                <w:p>
+                  <w:pPr>
+                    <w:keepNext w:val="0"/>
+                    <w:keepLines w:val="0"/>
+                    <w:pageBreakBefore w:val="0"/>
+                    <w:widowControl w:val="0"/>
+                    <w:pBdr>
+                      <w:top w:space="0" w:sz="0" w:val="nil"/>
+                      <w:left w:space="0" w:sz="0" w:val="nil"/>
+                      <w:bottom w:space="0" w:sz="0" w:val="nil"/>
+                      <w:right w:space="0" w:sz="0" w:val="nil"/>
+                      <w:between w:space="0" w:sz="0" w:val="nil"/>
+                    </w:pBdr>
+                    <w:shd w:fill="auto" w:val="clear"/>
+                    <w:spacing w:after="0" w:before="0" w:line="240" w:lineRule="auto"/>
+                    <w:ind w:left="0" w:right="0" w:firstLine="0"/>
+                    <w:rPr/>
+                  </w:pPr>
+                  <w:r>
+                    <w:rPr>
+                      <w:rtl w:val="0"/>
+                    </w:rPr>
+                  </w:r>
+                </w:p>
+              </w:tc>
+              <w:tc>
+                <w:tcPr>
+                  <w:tcBorders>
+                    <w:top w:color="000000" w:space="0" w:sz="0" w:val="nil"/>
+                    <w:left w:color="000000" w:space="0" w:sz="0" w:val="nil"/>
+                    <w:bottom w:color="000000" w:space="0" w:sz="0" w:val="nil"/>
+                    <w:right w:color="000000" w:space="0" w:sz="0" w:val="nil"/>
+                  </w:tcBorders>
+                  <w:shd w:fill="auto" w:val="clear"/>
+                  <w:tcMar>
+                    <w:top w:w="72.0" w:type="dxa"/>
+                    <w:left w:w="72.0" w:type="dxa"/>
+                    <w:bottom w:w="72.0" w:type="dxa"/>
+                    <w:right w:w="72.0" w:type="dxa"/>
+                  </w:tcMar>
+                  <w:vAlign w:val="top"/>
+                </w:tcPr>
+                <w:p>
+                  <w:pPr>
+                    <w:keepNext w:val="0"/>
+                    <w:keepLines w:val="0"/>
+                    <w:pageBreakBefore w:val="0"/>
+                    <w:widowControl w:val="0"/>
+                    <w:pBdr>
+                      <w:top w:space="0" w:sz="0" w:val="nil"/>
+                      <w:left w:space="0" w:sz="0" w:val="nil"/>
+                      <w:bottom w:space="0" w:sz="0" w:val="nil"/>
+                      <w:right w:space="0" w:sz="0" w:val="nil"/>
+                      <w:between w:space="0" w:sz="0" w:val="nil"/>
+                    </w:pBdr>
+                    <w:shd w:fill="auto" w:val="clear"/>
+                    <w:spacing w:after="0" w:before="0" w:line="240" w:lineRule="auto"/>
+                    <w:ind w:left="0" w:right="0" w:firstLine="0"/>
+                    <w:rPr>
+                      <w:b w:val="1"/>
+                      <w:bCs w:val="1"/>
+                    </w:rPr>
+                  </w:pPr>
+                  <w:r>
+                    <w:rPr>
+                      <w:b w:val="1"/>
+                      <w:bCs w:val="1"/>
+                      <w:rtl w:val="0"/>
+                    </w:rPr>
+                    <w:t xml:space="preserve">Statement Date:</w:t>
+                  </w:r>
+                </w:p>
+              </w:tc>
+              <w:tc>
+                <w:tcPr>
+                  <w:tcBorders>
+                    <w:top w:color="000000" w:space="0" w:sz="0" w:val="nil"/>
+                    <w:left w:color="000000" w:space="0" w:sz="0" w:val="nil"/>
+                    <w:bottom w:color="000000" w:space="0" w:sz="0" w:val="nil"/>
+                    <w:right w:color="000000" w:space="0" w:sz="0" w:val="nil"/>
+                  </w:tcBorders>
+                  <w:shd w:fill="auto" w:val="clear"/>
+                  <w:tcMar>
+                    <w:top w:w="72.0" w:type="dxa"/>
+                    <w:left w:w="72.0" w:type="dxa"/>
+                    <w:bottom w:w="72.0" w:type="dxa"/>
+                    <w:right w:w="72.0" w:type="dxa"/>
+                  </w:tcMar>
+                  <w:vAlign w:val="top"/>
+                </w:tcPr>
+                <w:p>
+                  <w:pPr>
+                    <w:keepNext w:val="0"/>
+                    <w:keepLines w:val="0"/>
+                    <w:pageBreakBefore w:val="0"/>
+                    <w:widowControl w:val="0"/>
+                    <w:pBdr>
+                      <w:top w:space="0" w:sz="0" w:val="nil"/>
+                      <w:left w:space="0" w:sz="0" w:val="nil"/>
+                      <w:bottom w:space="0" w:sz="0" w:val="nil"/>
+                      <w:right w:space="0" w:sz="0" w:val="nil"/>
+                      <w:between w:space="0" w:sz="0" w:val="nil"/>
+                    </w:pBdr>
+                    <w:shd w:fill="auto" w:val="clear"/>
+                    <w:spacing w:after="0" w:before="0" w:line="240" w:lineRule="auto"/>
+                    <w:ind w:left="0" w:right="0" w:firstLine="0"/>
+                    <w:rPr/>
+                  </w:pPr>
+                  <w:r>
+                    <w:rPr>
+                      <w:rtl w:val="0"/>
+                    </w:rPr>
+                    <w:t xml:space="preserve">${stmt_date}</w:t>
+                  </w:r>
+                </w:p>
+              </w:tc>
+            </w:tr>
+            <w:tr>
+              <w:trPr>
+                <w:cantSplit w:val="0"/>
+                <w:trHeight w:val="384" w:hRule="atLeast"/>
+                <w:tblHeader w:val="0"/>
+              </w:trPr>
+              <w:tc>
+                <w:tcPr>
+                  <w:tcBorders>
+                    <w:top w:color="000000" w:space="0" w:sz="0" w:val="nil"/>
+                    <w:left w:color="000000" w:space="0" w:sz="0" w:val="nil"/>
+                    <w:bottom w:color="000000" w:space="0" w:sz="0" w:val="nil"/>
+                    <w:right w:color="000000" w:space="0" w:sz="0" w:val="nil"/>
+                  </w:tcBorders>
+                  <w:shd w:fill="auto" w:val="clear"/>
+                  <w:tcMar>
+                    <w:top w:w="72.0" w:type="dxa"/>
+                    <w:left w:w="72.0" w:type="dxa"/>
+                    <w:bottom w:w="72.0" w:type="dxa"/>
+                    <w:right w:w="72.0" w:type="dxa"/>
+                  </w:tcMar>
+                  <w:vAlign w:val="top"/>
+                </w:tcPr>
+                <w:p>
+                  <w:pPr>
+                    <w:keepNext w:val="0"/>
+                    <w:keepLines w:val="0"/>
+                    <w:pageBreakBefore w:val="0"/>
+                    <w:widowControl w:val="0"/>
+                    <w:pBdr>
+                      <w:top w:space="0" w:sz="0" w:val="nil"/>
+                      <w:left w:space="0" w:sz="0" w:val="nil"/>
+                      <w:bottom w:space="0" w:sz="0" w:val="nil"/>
+                      <w:right w:space="0" w:sz="0" w:val="nil"/>
+                      <w:between w:space="0" w:sz="0" w:val="nil"/>
+                    </w:pBdr>
+                    <w:shd w:fill="auto" w:val="clear"/>
+                    <w:spacing w:after="0" w:before="0" w:line="240" w:lineRule="auto"/>
+                    <w:ind w:left="0" w:right="0" w:firstLine="0"/>
+                    <w:rPr>
+                      <w:b w:val="1"/>
+                      <w:bCs w:val="1"/>
+                    </w:rPr>
+                  </w:pPr>
+                  <w:r>
+                    <w:rPr>
+                      <w:b w:val="1"/>
+                      <w:bCs w:val="1"/>
+                      <w:rtl w:val="0"/>
+                    </w:rPr>
+                    <w:t xml:space="preserve">Address:</w:t>
+                  </w:r>
+                </w:p>
+              </w:tc>
+              <w:tc>
+                <w:tcPr>
+                  <w:tcBorders>
+                    <w:top w:color="000000" w:space="0" w:sz="0" w:val="nil"/>
+                    <w:left w:color="000000" w:space="0" w:sz="0" w:val="nil"/>
+                    <w:bottom w:color="000000" w:space="0" w:sz="0" w:val="nil"/>
+                    <w:right w:color="000000" w:space="0" w:sz="0" w:val="nil"/>
+                  </w:tcBorders>
+                  <w:shd w:fill="auto" w:val="clear"/>
+                  <w:tcMar>
+                    <w:top w:w="72.0" w:type="dxa"/>
+                    <w:left w:w="72.0" w:type="dxa"/>
+                    <w:bottom w:w="72.0" w:type="dxa"/>
+                    <w:right w:w="72.0" w:type="dxa"/>
+                  </w:tcMar>
+                  <w:vAlign w:val="top"/>
+                </w:tcPr>
+                <w:p>
+                  <w:pPr>
+                    <w:keepNext w:val="0"/>
+                    <w:keepLines w:val="0"/>
+                    <w:pageBreakBefore w:val="0"/>
+                    <w:widowControl w:val="0"/>
+                    <w:pBdr>
+                      <w:top w:space="0" w:sz="0" w:val="nil"/>
+                      <w:left w:space="0" w:sz="0" w:val="nil"/>
+                      <w:bottom w:space="0" w:sz="0" w:val="nil"/>
+                      <w:right w:space="0" w:sz="0" w:val="nil"/>
+                      <w:between w:space="0" w:sz="0" w:val="nil"/>
+                    </w:pBdr>
+                    <w:shd w:fill="auto" w:val="clear"/>
+                    <w:spacing w:after="0" w:before="0" w:line="240" w:lineRule="auto"/>
+                    <w:ind w:left="0" w:right="0" w:firstLine="0"/>
+                    <w:rPr/>
+                  </w:pPr>
+                  <w:r>
+                    <w:rPr>
+                      <w:rtl w:val="0"/>
+                    </w:rPr>
+                    <w:t xml:space="preserve">${address}</w:t>
+                  </w:r>
+                </w:p>
+              </w:tc>
+              <w:tc>
+                <w:tcPr>
+                  <w:tcBorders>
+                    <w:top w:color="000000" w:space="0" w:sz="0" w:val="nil"/>
+                    <w:left w:color="000000" w:space="0" w:sz="0" w:val="nil"/>
+                    <w:bottom w:color="000000" w:space="0" w:sz="0" w:val="nil"/>
+                    <w:right w:color="000000" w:space="0" w:sz="0" w:val="nil"/>
+                  </w:tcBorders>
+                  <w:shd w:fill="auto" w:val="clear"/>
+                  <w:tcMar>
+                    <w:top w:w="72.0" w:type="dxa"/>
+                    <w:left w:w="72.0" w:type="dxa"/>
+                    <w:bottom w:w="72.0" w:type="dxa"/>
+                    <w:right w:w="72.0" w:type="dxa"/>
+                  </w:tcMar>
+                  <w:vAlign w:val="top"/>
+                </w:tcPr>
+                <w:p>
+                  <w:pPr>
+                    <w:keepNext w:val="0"/>
+                    <w:keepLines w:val="0"/>
+                    <w:pageBreakBefore w:val="0"/>
+                    <w:widowControl w:val="0"/>
+                    <w:pBdr>
+                      <w:top w:space="0" w:sz="0" w:val="nil"/>
+                      <w:left w:space="0" w:sz="0" w:val="nil"/>
+                      <w:bottom w:space="0" w:sz="0" w:val="nil"/>
+                      <w:right w:space="0" w:sz="0" w:val="nil"/>
+                      <w:between w:space="0" w:sz="0" w:val="nil"/>
+                    </w:pBdr>
+                    <w:shd w:fill="auto" w:val="clear"/>
+                    <w:spacing w:after="0" w:before="0" w:line="240" w:lineRule="auto"/>
+                    <w:ind w:left="0" w:right="0" w:firstLine="0"/>
+                    <w:rPr/>
+                  </w:pPr>
+                  <w:r>
+                    <w:rPr>
+                      <w:rtl w:val="0"/>
+                    </w:rPr>
+                  </w:r>
+                </w:p>
+              </w:tc>
+              <w:tc>
+                <w:tcPr>
+                  <w:tcBorders>
+                    <w:top w:color="000000" w:space="0" w:sz="0" w:val="nil"/>
+                    <w:left w:color="000000" w:space="0" w:sz="0" w:val="nil"/>
+                    <w:bottom w:color="000000" w:space="0" w:sz="0" w:val="nil"/>
+                    <w:right w:color="000000" w:space="0" w:sz="0" w:val="nil"/>
+                  </w:tcBorders>
+                  <w:shd w:fill="auto" w:val="clear"/>
+                  <w:tcMar>
+                    <w:top w:w="72.0" w:type="dxa"/>
+                    <w:left w:w="72.0" w:type="dxa"/>
+                    <w:bottom w:w="72.0" w:type="dxa"/>
+                    <w:right w:w="72.0" w:type="dxa"/>
+                  </w:tcMar>
+                  <w:vAlign w:val="top"/>
+                </w:tcPr>
+                <w:p>
+                  <w:pPr>
+                    <w:keepNext w:val="0"/>
+                    <w:keepLines w:val="0"/>
+                    <w:pageBreakBefore w:val="0"/>
+                    <w:widowControl w:val="0"/>
+                    <w:pBdr>
+                      <w:top w:space="0" w:sz="0" w:val="nil"/>
+                      <w:left w:space="0" w:sz="0" w:val="nil"/>
+                      <w:bottom w:space="0" w:sz="0" w:val="nil"/>
+                      <w:right w:space="0" w:sz="0" w:val="nil"/>
+                      <w:between w:space="0" w:sz="0" w:val="nil"/>
+                    </w:pBdr>
+                    <w:shd w:fill="auto" w:val="clear"/>
+                    <w:spacing w:after="0" w:before="0" w:line="240" w:lineRule="auto"/>
+                    <w:ind w:left="0" w:right="0" w:firstLine="0"/>
+                    <w:rPr/>
+                  </w:pPr>
+                  <w:r>
+                    <w:rPr>
+                      <w:rtl w:val="0"/>
+                    </w:rPr>
+                  </w:r>
+                </w:p>
+              </w:tc>
+              <w:tc>
+                <w:tcPr>
+                  <w:tcBorders>
+                    <w:top w:color="000000" w:space="0" w:sz="0" w:val="nil"/>
+                    <w:left w:color="000000" w:space="0" w:sz="0" w:val="nil"/>
+                    <w:bottom w:color="000000" w:space="0" w:sz="0" w:val="nil"/>
+                    <w:right w:color="000000" w:space="0" w:sz="0" w:val="nil"/>
+                  </w:tcBorders>
+                  <w:shd w:fill="auto" w:val="clear"/>
+                  <w:tcMar>
+                    <w:top w:w="72.0" w:type="dxa"/>
+                    <w:left w:w="72.0" w:type="dxa"/>
+                    <w:bottom w:w="72.0" w:type="dxa"/>
+                    <w:right w:w="72.0" w:type="dxa"/>
+                  </w:tcMar>
+                  <w:vAlign w:val="top"/>
+                </w:tcPr>
+                <w:p>
+                  <w:pPr>
+                    <w:keepNext w:val="0"/>
+                    <w:keepLines w:val="0"/>
+                    <w:pageBreakBefore w:val="0"/>
+                    <w:widowControl w:val="0"/>
+                    <w:pBdr>
+                      <w:top w:space="0" w:sz="0" w:val="nil"/>
+                      <w:left w:space="0" w:sz="0" w:val="nil"/>
+                      <w:bottom w:space="0" w:sz="0" w:val="nil"/>
+                      <w:right w:space="0" w:sz="0" w:val="nil"/>
+                      <w:between w:space="0" w:sz="0" w:val="nil"/>
+                    </w:pBdr>
+                    <w:shd w:fill="auto" w:val="clear"/>
+                    <w:spacing w:after="0" w:before="0" w:line="240" w:lineRule="auto"/>
+                    <w:ind w:left="0" w:right="0" w:firstLine="0"/>
+                    <w:rPr>
+                      <w:b w:val="1"/>
+                      <w:bCs w:val="1"/>
+                    </w:rPr>
+                  </w:pPr>
+                  <w:r>
+                    <w:rPr>
+                      <w:b w:val="1"/>
+                      <w:bCs w:val="1"/>
+                      <w:rtl w:val="0"/>
+                    </w:rPr>
+                    <w:t xml:space="preserve">Balance Due:</w:t>
+                  </w:r>
+                </w:p>
+              </w:tc>
+              <w:tc>
+                <w:tcPr>
+                  <w:tcBorders>
+                    <w:top w:color="000000" w:space="0" w:sz="0" w:val="nil"/>
+                    <w:left w:color="000000" w:space="0" w:sz="0" w:val="nil"/>
+                    <w:bottom w:color="000000" w:space="0" w:sz="0" w:val="nil"/>
+                    <w:right w:color="000000" w:space="0" w:sz="0" w:val="nil"/>
+                  </w:tcBorders>
+                  <w:shd w:fill="auto" w:val="clear"/>
+                  <w:tcMar>
+                    <w:top w:w="72.0" w:type="dxa"/>
+                    <w:left w:w="72.0" w:type="dxa"/>
+                    <w:bottom w:w="72.0" w:type="dxa"/>
+                    <w:right w:w="72.0" w:type="dxa"/>
+                  </w:tcMar>
+                  <w:vAlign w:val="top"/>
+                </w:tcPr>
+                <w:p>
+                  <w:pPr>
+                    <w:keepNext w:val="0"/>
+                    <w:keepLines w:val="0"/>
+                    <w:pageBreakBefore w:val="0"/>
+                    <w:widowControl w:val="0"/>
+                    <w:pBdr>
+                      <w:top w:space="0" w:sz="0" w:val="nil"/>
+                      <w:left w:space="0" w:sz="0" w:val="nil"/>
+                      <w:bottom w:space="0" w:sz="0" w:val="nil"/>
+                      <w:right w:space="0" w:sz="0" w:val="nil"/>
+                      <w:between w:space="0" w:sz="0" w:val="nil"/>
+                    </w:pBdr>
+                    <w:shd w:fill="auto" w:val="clear"/>
+                    <w:spacing w:after="0" w:before="0" w:line="240" w:lineRule="auto"/>
+                    <w:ind w:left="0" w:right="0" w:firstLine="0"/>
+                    <w:rPr/>
+                  </w:pPr>
+                  <w:r>
+                    <w:rPr>
+                      <w:rtl w:val="0"/>
+                    </w:rPr>
+                    <w:t xml:space="preserve">${balance_due}</w:t>
+                  </w:r>
+                </w:p>
+              </w:tc>
+            </w:tr>
+            <w:tr>
+              <w:trPr>
+                <w:cantSplit w:val="0"/>
+                <w:trHeight w:val="384" w:hRule="atLeast"/>
+                <w:tblHeader w:val="0"/>
+              </w:trPr>
+              <w:tc>
+                <w:tcPr>
+                  <w:tcBorders>
+                    <w:top w:color="000000" w:space="0" w:sz="0" w:val="nil"/>
+                    <w:left w:color="000000" w:space="0" w:sz="0" w:val="nil"/>
+                    <w:bottom w:color="000000" w:space="0" w:sz="0" w:val="nil"/>
+                    <w:right w:color="000000" w:space="0" w:sz="0" w:val="nil"/>
+                  </w:tcBorders>
+                  <w:shd w:fill="auto" w:val="clear"/>
+                  <w:tcMar>
+                    <w:top w:w="72.0" w:type="dxa"/>
+                    <w:left w:w="72.0" w:type="dxa"/>
+                    <w:bottom w:w="72.0" w:type="dxa"/>
+                    <w:right w:w="72.0" w:type="dxa"/>
+                  </w:tcMar>
+                  <w:vAlign w:val="top"/>
+                </w:tcPr>
+                <w:p>
+                  <w:pPr>
+                    <w:keepNext w:val="0"/>
+                    <w:keepLines w:val="0"/>
+                    <w:pageBreakBefore w:val="0"/>
+                    <w:widowControl w:val="0"/>
+                    <w:pBdr>
+                      <w:top w:space="0" w:sz="0" w:val="nil"/>
+                      <w:left w:space="0" w:sz="0" w:val="nil"/>
+                      <w:bottom w:space="0" w:sz="0" w:val="nil"/>
+                      <w:right w:space="0" w:sz="0" w:val="nil"/>
+                      <w:between w:space="0" w:sz="0" w:val="nil"/>
+                    </w:pBdr>
+                    <w:shd w:fill="auto" w:val="clear"/>
+                    <w:spacing w:after="0" w:before="0" w:line="240" w:lineRule="auto"/>
+                    <w:ind w:left="0" w:right="0" w:firstLine="0"/>
+                    <w:rPr>
+                      <w:b w:val="1"/>
+                      <w:bCs w:val="1"/>
+                    </w:rPr>
+                  </w:pPr>
+                  <w:r>
+                    <w:rPr>
+                      <w:b w:val="1"/>
+                      <w:bCs w:val="1"/>
+                      <w:rtl w:val="0"/>
+                    </w:rPr>
+                    <w:t xml:space="preserve">City:</w:t>
+                  </w:r>
+                </w:p>
+              </w:tc>
+              <w:tc>
+                <w:tcPr>
+                  <w:tcBorders>
+                    <w:top w:color="000000" w:space="0" w:sz="0" w:val="nil"/>
+                    <w:left w:color="000000" w:space="0" w:sz="0" w:val="nil"/>
+                    <w:bottom w:color="000000" w:space="0" w:sz="0" w:val="nil"/>
+                    <w:right w:color="000000" w:space="0" w:sz="0" w:val="nil"/>
+                  </w:tcBorders>
+                  <w:shd w:fill="auto" w:val="clear"/>
+                  <w:tcMar>
+                    <w:top w:w="72.0" w:type="dxa"/>
+                    <w:left w:w="72.0" w:type="dxa"/>
+                    <w:bottom w:w="72.0" w:type="dxa"/>
+                    <w:right w:w="72.0" w:type="dxa"/>
+                  </w:tcMar>
+                  <w:vAlign w:val="top"/>
+                </w:tcPr>
+                <w:p>
+                  <w:pPr>
+                    <w:keepNext w:val="0"/>
+                    <w:keepLines w:val="0"/>
+                    <w:pageBreakBefore w:val="0"/>
+                    <w:widowControl w:val="0"/>
+                    <w:pBdr>
+                      <w:top w:space="0" w:sz="0" w:val="nil"/>
+                      <w:left w:space="0" w:sz="0" w:val="nil"/>
+                      <w:bottom w:space="0" w:sz="0" w:val="nil"/>
+                      <w:right w:space="0" w:sz="0" w:val="nil"/>
+                      <w:between w:space="0" w:sz="0" w:val="nil"/>
+                    </w:pBdr>
+                    <w:shd w:fill="auto" w:val="clear"/>
+                    <w:spacing w:after="0" w:before="0" w:line="240" w:lineRule="auto"/>
+                    <w:ind w:left="0" w:right="0" w:firstLine="0"/>
+                    <w:rPr/>
+                  </w:pPr>
+                  <w:r>
+                    <w:rPr>
+                      <w:rtl w:val="0"/>
+                    </w:rPr>
+                    <w:t xml:space="preserve">${city}, ${state} ${zip}</w:t>
+                  </w:r>
+                </w:p>
+              </w:tc>
+              <w:tc>
+                <w:tcPr>
+                  <w:tcBorders>
+                    <w:top w:color="000000" w:space="0" w:sz="0" w:val="nil"/>
+                    <w:left w:color="000000" w:space="0" w:sz="0" w:val="nil"/>
+                    <w:bottom w:color="000000" w:space="0" w:sz="0" w:val="nil"/>
+                    <w:right w:color="000000" w:space="0" w:sz="0" w:val="nil"/>
+                  </w:tcBorders>
+                  <w:shd w:fill="auto" w:val="clear"/>
+                  <w:tcMar>
+                    <w:top w:w="72.0" w:type="dxa"/>
+                    <w:left w:w="72.0" w:type="dxa"/>
+                    <w:bottom w:w="72.0" w:type="dxa"/>
+                    <w:right w:w="72.0" w:type="dxa"/>
+                  </w:tcMar>
+                  <w:vAlign w:val="top"/>
+                </w:tcPr>
+                <w:p>
+                  <w:pPr>
+                    <w:keepNext w:val="0"/>
+                    <w:keepLines w:val="0"/>
+                    <w:pageBreakBefore w:val="0"/>
+                    <w:widowControl w:val="0"/>
+                    <w:pBdr>
+                      <w:top w:space="0" w:sz="0" w:val="nil"/>
+                      <w:left w:space="0" w:sz="0" w:val="nil"/>
+                      <w:bottom w:space="0" w:sz="0" w:val="nil"/>
+                      <w:right w:space="0" w:sz="0" w:val="nil"/>
+                      <w:between w:space="0" w:sz="0" w:val="nil"/>
+                    </w:pBdr>
+                    <w:shd w:fill="auto" w:val="clear"/>
+                    <w:spacing w:after="0" w:before="0" w:line="240" w:lineRule="auto"/>
+                    <w:ind w:left="0" w:right="0" w:firstLine="0"/>
+                    <w:rPr/>
+                  </w:pPr>
+                  <w:r>
+                    <w:rPr>
+                      <w:rtl w:val="0"/>
+                    </w:rPr>
+                  </w:r>
+                </w:p>
+              </w:tc>
+              <w:tc>
+                <w:tcPr>
+                  <w:tcBorders>
+                    <w:top w:color="000000" w:space="0" w:sz="0" w:val="nil"/>
+                    <w:left w:color="000000" w:space="0" w:sz="0" w:val="nil"/>
+                    <w:bottom w:color="000000" w:space="0" w:sz="0" w:val="nil"/>
+                    <w:right w:color="000000" w:space="0" w:sz="0" w:val="nil"/>
+                  </w:tcBorders>
+                  <w:shd w:fill="auto" w:val="clear"/>
+                  <w:tcMar>
+                    <w:top w:w="72.0" w:type="dxa"/>
+                    <w:left w:w="72.0" w:type="dxa"/>
+                    <w:bottom w:w="72.0" w:type="dxa"/>
+                    <w:right w:w="72.0" w:type="dxa"/>
+                  </w:tcMar>
+                  <w:vAlign w:val="top"/>
+                </w:tcPr>
+                <w:p>
+                  <w:pPr>
+                    <w:keepNext w:val="0"/>
+                    <w:keepLines w:val="0"/>
+                    <w:pageBreakBefore w:val="0"/>
+                    <w:widowControl w:val="0"/>
+                    <w:pBdr>
+                      <w:top w:space="0" w:sz="0" w:val="nil"/>
+                      <w:left w:space="0" w:sz="0" w:val="nil"/>
+                      <w:bottom w:space="0" w:sz="0" w:val="nil"/>
+                      <w:right w:space="0" w:sz="0" w:val="nil"/>
+                      <w:between w:space="0" w:sz="0" w:val="nil"/>
+                    </w:pBdr>
+                    <w:shd w:fill="auto" w:val="clear"/>
+                    <w:spacing w:after="0" w:before="0" w:line="240" w:lineRule="auto"/>
+                    <w:ind w:left="0" w:right="0" w:firstLine="0"/>
+                    <w:rPr/>
+                  </w:pPr>
+                  <w:r>
+                    <w:rPr>
+                      <w:rtl w:val="0"/>
+                    </w:rPr>
+                  </w:r>
+                </w:p>
+              </w:tc>
+              <w:tc>
+                <w:tcPr>
+                  <w:tcBorders>
+                    <w:top w:color="000000" w:space="0" w:sz="0" w:val="nil"/>
+                    <w:left w:color="000000" w:space="0" w:sz="0" w:val="nil"/>
+                    <w:bottom w:color="000000" w:space="0" w:sz="0" w:val="nil"/>
+                    <w:right w:color="000000" w:space="0" w:sz="0" w:val="nil"/>
+                  </w:tcBorders>
+                  <w:shd w:fill="auto" w:val="clear"/>
+                  <w:tcMar>
+                    <w:top w:w="72.0" w:type="dxa"/>
+                    <w:left w:w="72.0" w:type="dxa"/>
+                    <w:bottom w:w="72.0" w:type="dxa"/>
+                    <w:right w:w="72.0" w:type="dxa"/>
+                  </w:tcMar>
+                  <w:vAlign w:val="top"/>
+                </w:tcPr>
+                <w:p>
+                  <w:pPr>
+                    <w:keepNext w:val="0"/>
+                    <w:keepLines w:val="0"/>
+                    <w:pageBreakBefore w:val="0"/>
+                    <w:widowControl w:val="0"/>
+                    <w:pBdr>
+                      <w:top w:space="0" w:sz="0" w:val="nil"/>
+                      <w:left w:space="0" w:sz="0" w:val="nil"/>
+                      <w:bottom w:space="0" w:sz="0" w:val="nil"/>
+                      <w:right w:space="0" w:sz="0" w:val="nil"/>
+                      <w:between w:space="0" w:sz="0" w:val="nil"/>
+                    </w:pBdr>
+                    <w:shd w:fill="auto" w:val="clear"/>
+                    <w:spacing w:after="0" w:before="0" w:line="240" w:lineRule="auto"/>
+                    <w:ind w:left="0" w:right="0" w:firstLine="0"/>
+                    <w:rPr/>
+                  </w:pPr>
+                  <w:r>
+                    <w:rPr>
+                      <w:rtl w:val="0"/>
+                    </w:rPr>
+                  </w:r>
+                </w:p>
+              </w:tc>
+              <w:tc>
+                <w:tcPr>
+                  <w:tcBorders>
+                    <w:top w:color="000000" w:space="0" w:sz="0" w:val="nil"/>
+                    <w:left w:color="000000" w:space="0" w:sz="0" w:val="nil"/>
+                    <w:bottom w:color="000000" w:space="0" w:sz="0" w:val="nil"/>
+                    <w:right w:color="000000" w:space="0" w:sz="0" w:val="nil"/>
+                  </w:tcBorders>
+                  <w:shd w:fill="auto" w:val="clear"/>
+                  <w:tcMar>
+                    <w:top w:w="72.0" w:type="dxa"/>
+                    <w:left w:w="72.0" w:type="dxa"/>
+                    <w:bottom w:w="72.0" w:type="dxa"/>
+                    <w:right w:w="72.0" w:type="dxa"/>
+                  </w:tcMar>
+                  <w:vAlign w:val="top"/>
+                </w:tcPr>
+                <w:p>
+                  <w:pPr>
+                    <w:keepNext w:val="0"/>
+                    <w:keepLines w:val="0"/>
+                    <w:pageBreakBefore w:val="0"/>
+                    <w:widowControl w:val="0"/>
+                    <w:pBdr>
+                      <w:top w:space="0" w:sz="0" w:val="nil"/>
+                      <w:left w:space="0" w:sz="0" w:val="nil"/>
+                      <w:bottom w:space="0" w:sz="0" w:val="nil"/>
+                      <w:right w:space="0" w:sz="0" w:val="nil"/>
+                      <w:between w:space="0" w:sz="0" w:val="nil"/>
+                    </w:pBdr>
+                    <w:shd w:fill="auto" w:val="clear"/>
+                    <w:spacing w:after="0" w:before="0" w:line="240" w:lineRule="auto"/>
+                    <w:ind w:left="0" w:right="0" w:firstLine="0"/>
+                    <w:rPr/>
+                  </w:pPr>
+                  <w:r>
+                    <w:rPr>
+                      <w:rtl w:val="0"/>
+                    </w:rPr>
                   </w:r>
                 </w:p>
               </w:tc>
@@ -289,7 +1064,7 @@
           <w:tbl>
             <w:tblPr>
               <w:tblStyle w:val="Table3"/>
-              <w:tblW w:w="11304.0" w:type="dxa"/>
+              <w:tblW w:w="11160.0" w:type="dxa"/>
               <w:jc w:val="left"/>
               <w:tblBorders>
                 <w:top w:color="000000" w:space="0" w:sz="0" w:val="nil"/>
@@ -303,20 +1078,18 @@
               <w:tblLook w:val="0600"/>
             </w:tblPr>
             <w:tblGrid>
+              <w:gridCol w:w="1080"/>
               <w:gridCol w:w="2160"/>
-              <w:gridCol w:w="1440"/>
-              <w:gridCol w:w="3240"/>
-              <w:gridCol w:w="1440"/>
-              <w:gridCol w:w="1440"/>
-              <w:gridCol w:w="1584"/>
+              <w:gridCol w:w="2160"/>
+              <w:gridCol w:w="3600"/>
+              <w:gridCol w:w="2160"/>
               <w:tblGridChange w:id="0">
                 <w:tblGrid>
+                  <w:gridCol w:w="1080"/>
                   <w:gridCol w:w="2160"/>
-                  <w:gridCol w:w="1440"/>
-                  <w:gridCol w:w="3240"/>
-                  <w:gridCol w:w="1440"/>
-                  <w:gridCol w:w="1440"/>
-                  <w:gridCol w:w="1584"/>
+                  <w:gridCol w:w="2160"/>
+                  <w:gridCol w:w="3600"/>
+                  <w:gridCol w:w="2160"/>
                 </w:tblGrid>
               </w:tblGridChange>
             </w:tblGrid>
@@ -340,12 +1113,18 @@
                     <w:rPr>
                       <w:b w:val="1"/>
                       <w:bCs w:val="1"/>
-                    </w:rPr>
-                  </w:pPr>
-                  <w:r>
-                    <w:rPr>
-                      <w:b w:val="1"/>
-                      <w:bCs w:val="1"/>
+                      <w:sz w:val="22"/>
+                      <w:szCs w:val="22"/>
+                      <w:u w:val="single"/>
+                    </w:rPr>
+                  </w:pPr>
+                  <w:r>
+                    <w:rPr>
+                      <w:b w:val="1"/>
+                      <w:bCs w:val="1"/>
+                      <w:sz w:val="22"/>
+                      <w:szCs w:val="22"/>
+                      <w:u w:val="single"/>
                       <w:rtl w:val="0"/>
                     </w:rPr>
                     <w:t xml:space="preserve">Date</w:t>
@@ -366,15 +1145,21 @@
                     <w:rPr>
                       <w:b w:val="1"/>
                       <w:bCs w:val="1"/>
-                    </w:rPr>
-                  </w:pPr>
-                  <w:r>
-                    <w:rPr>
-                      <w:b w:val="1"/>
-                      <w:bCs w:val="1"/>
-                      <w:rtl w:val="0"/>
-                    </w:rPr>
-                    <w:t xml:space="preserve">Event</w:t>
+                      <w:sz w:val="22"/>
+                      <w:szCs w:val="22"/>
+                      <w:u w:val="single"/>
+                    </w:rPr>
+                  </w:pPr>
+                  <w:r>
+                    <w:rPr>
+                      <w:b w:val="1"/>
+                      <w:bCs w:val="1"/>
+                      <w:sz w:val="22"/>
+                      <w:szCs w:val="22"/>
+                      <w:u w:val="single"/>
+                      <w:rtl w:val="0"/>
+                    </w:rPr>
+                    <w:t xml:space="preserve">Session</w:t>
                   </w:r>
                 </w:p>
               </w:tc>
@@ -392,15 +1177,21 @@
                     <w:rPr>
                       <w:b w:val="1"/>
                       <w:bCs w:val="1"/>
-                    </w:rPr>
-                  </w:pPr>
-                  <w:r>
-                    <w:rPr>
-                      <w:b w:val="1"/>
-                      <w:bCs w:val="1"/>
-                      <w:rtl w:val="0"/>
-                    </w:rPr>
-                    <w:t xml:space="preserve">Description</w:t>
+                      <w:sz w:val="22"/>
+                      <w:szCs w:val="22"/>
+                      <w:u w:val="single"/>
+                    </w:rPr>
+                  </w:pPr>
+                  <w:r>
+                    <w:rPr>
+                      <w:b w:val="1"/>
+                      <w:bCs w:val="1"/>
+                      <w:sz w:val="22"/>
+                      <w:szCs w:val="22"/>
+                      <w:u w:val="single"/>
+                      <w:rtl w:val="0"/>
+                    </w:rPr>
+                    <w:t xml:space="preserve">Name</w:t>
                   </w:r>
                 </w:p>
               </w:tc>
@@ -418,15 +1209,21 @@
                     <w:rPr>
                       <w:b w:val="1"/>
                       <w:bCs w:val="1"/>
-                    </w:rPr>
-                  </w:pPr>
-                  <w:r>
-                    <w:rPr>
-                      <w:b w:val="1"/>
-                      <w:bCs w:val="1"/>
-                      <w:rtl w:val="0"/>
-                    </w:rPr>
-                    <w:t xml:space="preserve">Debit</w:t>
+                      <w:sz w:val="22"/>
+                      <w:szCs w:val="22"/>
+                      <w:u w:val="single"/>
+                    </w:rPr>
+                  </w:pPr>
+                  <w:r>
+                    <w:rPr>
+                      <w:b w:val="1"/>
+                      <w:bCs w:val="1"/>
+                      <w:sz w:val="22"/>
+                      <w:szCs w:val="22"/>
+                      <w:u w:val="single"/>
+                      <w:rtl w:val="0"/>
+                    </w:rPr>
+                    <w:t xml:space="preserve">Description</w:t>
                   </w:r>
                 </w:p>
               </w:tc>
@@ -444,41 +1241,21 @@
                     <w:rPr>
                       <w:b w:val="1"/>
                       <w:bCs w:val="1"/>
-                    </w:rPr>
-                  </w:pPr>
-                  <w:r>
-                    <w:rPr>
-                      <w:b w:val="1"/>
-                      <w:bCs w:val="1"/>
-                      <w:rtl w:val="0"/>
-                    </w:rPr>
-                    <w:t xml:space="preserve">Credit</w:t>
-                  </w:r>
-                </w:p>
-              </w:tc>
-              <w:tc>
-                <w:tcPr>
-                  <w:tcBorders>
-                    <w:top w:color="000000" w:space="0" w:sz="8" w:val="single"/>
-                    <w:left w:color="000000" w:space="0" w:sz="8" w:val="single"/>
-                    <w:bottom w:color="000000" w:space="0" w:sz="8" w:val="single"/>
-                    <w:right w:color="000000" w:space="0" w:sz="8" w:val="single"/>
-                  </w:tcBorders>
-                </w:tcPr>
-                <w:p>
-                  <w:pPr>
-                    <w:rPr>
-                      <w:b w:val="1"/>
-                      <w:bCs w:val="1"/>
-                    </w:rPr>
-                  </w:pPr>
-                  <w:r>
-                    <w:rPr>
-                      <w:b w:val="1"/>
-                      <w:bCs w:val="1"/>
-                      <w:rtl w:val="0"/>
-                    </w:rPr>
-                    <w:t xml:space="preserve">Balance</w:t>
+                      <w:sz w:val="22"/>
+                      <w:szCs w:val="22"/>
+                      <w:u w:val="single"/>
+                    </w:rPr>
+                  </w:pPr>
+                  <w:r>
+                    <w:rPr>
+                      <w:b w:val="1"/>
+                      <w:bCs w:val="1"/>
+                      <w:sz w:val="22"/>
+                      <w:szCs w:val="22"/>
+                      <w:u w:val="single"/>
+                      <w:rtl w:val="0"/>
+                    </w:rPr>
+                    <w:t xml:space="preserve">Previous Balance</w:t>
                   </w:r>
                 </w:p>
               </w:tc>
@@ -500,10 +1277,15 @@
                 </w:tcPr>
                 <w:p>
                   <w:pPr>
-                    <w:rPr/>
-                  </w:pPr>
-                  <w:r>
-                    <w:rPr>
+                    <w:rPr>
+                      <w:sz w:val="22"/>
+                      <w:szCs w:val="22"/>
+                    </w:rPr>
+                  </w:pPr>
+                  <w:r>
+                    <w:rPr>
+                      <w:sz w:val="22"/>
+                      <w:szCs w:val="22"/>
                       <w:rtl w:val="0"/>
                     </w:rPr>
                     <w:t xml:space="preserve">${date}</w:t>
@@ -521,13 +1303,18 @@
                 </w:tcPr>
                 <w:p>
                   <w:pPr>
-                    <w:rPr/>
-                  </w:pPr>
-                  <w:r>
-                    <w:rPr>
-                      <w:rtl w:val="0"/>
-                    </w:rPr>
-                    <w:t xml:space="preserve">${event}</w:t>
+                    <w:rPr>
+                      <w:sz w:val="22"/>
+                      <w:szCs w:val="22"/>
+                    </w:rPr>
+                  </w:pPr>
+                  <w:r>
+                    <w:rPr>
+                      <w:sz w:val="22"/>
+                      <w:szCs w:val="22"/>
+                      <w:rtl w:val="0"/>
+                    </w:rPr>
+                    <w:t xml:space="preserve">${session}</w:t>
                   </w:r>
                 </w:p>
               </w:tc>
@@ -542,13 +1329,18 @@
                 </w:tcPr>
                 <w:p>
                   <w:pPr>
-                    <w:rPr/>
-                  </w:pPr>
-                  <w:r>
-                    <w:rPr>
-                      <w:rtl w:val="0"/>
-                    </w:rPr>
-                    <w:t xml:space="preserve">${description}</w:t>
+                    <w:rPr>
+                      <w:sz w:val="22"/>
+                      <w:szCs w:val="22"/>
+                    </w:rPr>
+                  </w:pPr>
+                  <w:r>
+                    <w:rPr>
+                      <w:sz w:val="22"/>
+                      <w:szCs w:val="22"/>
+                      <w:rtl w:val="0"/>
+                    </w:rPr>
+                    <w:t xml:space="preserve">${name}</w:t>
                   </w:r>
                 </w:p>
               </w:tc>
@@ -563,13 +1355,18 @@
                 </w:tcPr>
                 <w:p>
                   <w:pPr>
-                    <w:rPr/>
-                  </w:pPr>
-                  <w:r>
-                    <w:rPr>
-                      <w:rtl w:val="0"/>
-                    </w:rPr>
-                    <w:t xml:space="preserve">${debit}</w:t>
+                    <w:rPr>
+                      <w:sz w:val="22"/>
+                      <w:szCs w:val="22"/>
+                    </w:rPr>
+                  </w:pPr>
+                  <w:r>
+                    <w:rPr>
+                      <w:sz w:val="22"/>
+                      <w:szCs w:val="22"/>
+                      <w:rtl w:val="0"/>
+                    </w:rPr>
+                    <w:t xml:space="preserve">${description}</w:t>
                   </w:r>
                 </w:p>
               </w:tc>
@@ -584,31 +1381,15 @@
                 </w:tcPr>
                 <w:p>
                   <w:pPr>
-                    <w:rPr/>
-                  </w:pPr>
-                  <w:r>
-                    <w:rPr>
-                      <w:rtl w:val="0"/>
-                    </w:rPr>
-                    <w:t xml:space="preserve">${credit}</w:t>
-                  </w:r>
-                </w:p>
-              </w:tc>
-              <w:tc>
-                <w:tcPr>
-                  <w:tcBorders>
-                    <w:top w:color="000000" w:space="0" w:sz="8" w:val="single"/>
-                    <w:left w:color="000000" w:space="0" w:sz="8" w:val="single"/>
-                    <w:bottom w:color="000000" w:space="0" w:sz="8" w:val="single"/>
-                    <w:right w:color="000000" w:space="0" w:sz="8" w:val="single"/>
-                  </w:tcBorders>
-                </w:tcPr>
-                <w:p>
-                  <w:pPr>
-                    <w:rPr/>
-                  </w:pPr>
-                  <w:r>
-                    <w:rPr>
+                    <w:rPr>
+                      <w:sz w:val="22"/>
+                      <w:szCs w:val="22"/>
+                    </w:rPr>
+                  </w:pPr>
+                  <w:r>
+                    <w:rPr>
+                      <w:sz w:val="22"/>
+                      <w:szCs w:val="22"/>
                       <w:rtl w:val="0"/>
                     </w:rPr>
                     <w:t xml:space="preserve">${balance}</w:t>
@@ -697,7 +1478,7 @@
           <w:tbl>
             <w:tblPr>
               <w:tblStyle w:val="Table4"/>
-              <w:tblW w:w="11310.0" w:type="dxa"/>
+              <w:tblW w:w="11190.0" w:type="dxa"/>
               <w:jc w:val="left"/>
               <w:tblBorders>
                 <w:top w:color="000000" w:space="0" w:sz="8" w:val="single"/>
@@ -711,22 +1492,198 @@
               <w:tblLook w:val="0600"/>
             </w:tblPr>
             <w:tblGrid>
-              <w:gridCol w:w="3105"/>
-              <w:gridCol w:w="8205"/>
+              <w:gridCol w:w="3600"/>
+              <w:gridCol w:w="390"/>
+              <w:gridCol w:w="3600"/>
+              <w:gridCol w:w="3600"/>
               <w:tblGridChange w:id="0">
                 <w:tblGrid>
-                  <w:gridCol w:w="3105"/>
-                  <w:gridCol w:w="8205"/>
+                  <w:gridCol w:w="3600"/>
+                  <w:gridCol w:w="390"/>
+                  <w:gridCol w:w="3600"/>
+                  <w:gridCol w:w="3600"/>
                 </w:tblGrid>
               </w:tblGridChange>
             </w:tblGrid>
             <w:tr>
               <w:trPr>
                 <w:cantSplit w:val="0"/>
+                <w:trHeight w:val="440" w:hRule="atLeast"/>
                 <w:tblHeader w:val="0"/>
               </w:trPr>
               <w:tc>
                 <w:tcPr>
+                  <w:gridSpan w:val="4"/>
+                  <w:tcBorders>
+                    <w:top w:color="000000" w:space="0" w:sz="0" w:val="nil"/>
+                    <w:left w:color="000000" w:space="0" w:sz="0" w:val="nil"/>
+                  </w:tcBorders>
+                  <w:shd w:fill="auto" w:val="clear"/>
+                  <w:tcMar>
+                    <w:top w:w="100.0" w:type="dxa"/>
+                    <w:left w:w="100.0" w:type="dxa"/>
+                    <w:bottom w:w="100.0" w:type="dxa"/>
+                    <w:right w:w="100.0" w:type="dxa"/>
+                  </w:tcMar>
+                  <w:vAlign w:val="top"/>
+                </w:tcPr>
+                <w:p>
+                  <w:pPr>
+                    <w:widowControl w:val="0"/>
+                    <w:spacing w:after="0" w:line="240" w:lineRule="auto"/>
+                    <w:jc w:val="center"/>
+                    <w:rPr>
+                      <w:b w:val="1"/>
+                      <w:bCs w:val="1"/>
+                      <w:sz w:val="20"/>
+                      <w:szCs w:val="20"/>
+                    </w:rPr>
+                  </w:pPr>
+                  <w:r>
+                    <w:rPr>
+                      <w:b w:val="1"/>
+                      <w:bCs w:val="1"/>
+                      <w:sz w:val="20"/>
+                      <w:szCs w:val="20"/>
+                      <w:rtl w:val="0"/>
+                    </w:rPr>
+                    <w:t xml:space="preserve">Please Return Bottom Portion with Your Payment</w:t>
+                  </w:r>
+                </w:p>
+              </w:tc>
+            </w:tr>
+            <w:tr>
+              <w:trPr>
+                <w:cantSplit w:val="0"/>
+                <w:trHeight w:val="440" w:hRule="atLeast"/>
+                <w:tblHeader w:val="0"/>
+              </w:trPr>
+              <w:tc>
+                <w:tcPr>
+                  <w:gridSpan w:val="2"/>
+                  <w:vMerge w:val="restart"/>
+                  <w:shd w:fill="auto" w:val="clear"/>
+                  <w:tcMar>
+                    <w:top w:w="100.0" w:type="dxa"/>
+                    <w:left w:w="100.0" w:type="dxa"/>
+                    <w:bottom w:w="100.0" w:type="dxa"/>
+                    <w:right w:w="100.0" w:type="dxa"/>
+                  </w:tcMar>
+                  <w:vAlign w:val="top"/>
+                </w:tcPr>
+                <w:p>
+                  <w:pPr>
+                    <w:widowControl w:val="0"/>
+                    <w:spacing w:after="0" w:line="240" w:lineRule="auto"/>
+                    <w:rPr>
+                      <w:b w:val="1"/>
+                      <w:bCs w:val="1"/>
+                      <w:u w:val="single"/>
+                    </w:rPr>
+                  </w:pPr>
+                  <w:r>
+                    <w:rPr>
+                      <w:b w:val="1"/>
+                      <w:bCs w:val="1"/>
+                      <w:rtl w:val="0"/>
+                    </w:rPr>
+                    <w:t xml:space="preserve">Family ID: $</w:t>
+                  </w:r>
+                  <w:r>
+                    <w:rPr>
+                      <w:b w:val="1"/>
+                      <w:bCs w:val="1"/>
+                      <w:u w:val="single"/>
+                      <w:rtl w:val="0"/>
+                    </w:rPr>
+                    <w:t xml:space="preserve">{family_id}</w:t>
+                  </w:r>
+                </w:p>
+              </w:tc>
+              <w:tc>
+                <w:tcPr>
+                  <w:vMerge w:val="restart"/>
+                  <w:tcBorders>
+                    <w:left w:color="000000" w:space="0" w:sz="0" w:val="nil"/>
+                    <w:right w:color="000000" w:space="0" w:sz="0" w:val="nil"/>
+                  </w:tcBorders>
+                  <w:shd w:fill="auto" w:val="clear"/>
+                  <w:tcMar>
+                    <w:top w:w="100.0" w:type="dxa"/>
+                    <w:left w:w="100.0" w:type="dxa"/>
+                    <w:bottom w:w="100.0" w:type="dxa"/>
+                    <w:right w:w="100.0" w:type="dxa"/>
+                  </w:tcMar>
+                  <w:vAlign w:val="top"/>
+                </w:tcPr>
+                <w:p>
+                  <w:pPr>
+                    <w:widowControl w:val="0"/>
+                    <w:spacing w:after="0" w:line="240" w:lineRule="auto"/>
+                    <w:jc w:val="center"/>
+                    <w:rPr>
+                      <w:b w:val="1"/>
+                      <w:bCs w:val="1"/>
+                    </w:rPr>
+                  </w:pPr>
+                  <w:r>
+                    <w:rPr>
+                      <w:b w:val="1"/>
+                      <w:bCs w:val="1"/>
+                      <w:rtl w:val="0"/>
+                    </w:rPr>
+                    <w:t xml:space="preserve">Balance Due: ${balance_due}</w:t>
+                  </w:r>
+                </w:p>
+              </w:tc>
+              <w:tc>
+                <w:tcPr>
+                  <w:vMerge w:val="restart"/>
+                  <w:tcBorders>
+                    <w:left w:color="000000" w:space="0" w:sz="0" w:val="nil"/>
+                  </w:tcBorders>
+                  <w:shd w:fill="auto" w:val="clear"/>
+                  <w:tcMar>
+                    <w:top w:w="100.0" w:type="dxa"/>
+                    <w:left w:w="100.0" w:type="dxa"/>
+                    <w:bottom w:w="100.0" w:type="dxa"/>
+                    <w:right w:w="100.0" w:type="dxa"/>
+                  </w:tcMar>
+                  <w:vAlign w:val="top"/>
+                </w:tcPr>
+                <w:p>
+                  <w:pPr>
+                    <w:widowControl w:val="0"/>
+                    <w:spacing w:after="0" w:line="240" w:lineRule="auto"/>
+                    <w:rPr>
+                      <w:b w:val="1"/>
+                      <w:bCs w:val="1"/>
+                    </w:rPr>
+                  </w:pPr>
+                  <w:r>
+                    <w:rPr>
+                      <w:b w:val="1"/>
+                      <w:bCs w:val="1"/>
+                      <w:rtl w:val="0"/>
+                    </w:rPr>
+                    <w:t xml:space="preserve">Statement Date: ${stmt_date}</w:t>
+                  </w:r>
+                </w:p>
+              </w:tc>
+            </w:tr>
+            <w:tr>
+              <w:trPr>
+                <w:cantSplit w:val="0"/>
+                <w:trHeight w:val="285" w:hRule="atLeast"/>
+                <w:tblHeader w:val="0"/>
+              </w:trPr>
+              <w:tc>
+                <w:tcPr>
+                  <w:gridSpan w:val="2"/>
+                  <w:vMerge w:val="continue"/>
+                  <w:tcBorders>
+                    <w:bottom w:color="000000" w:space="0" w:sz="0" w:val="nil"/>
+                  </w:tcBorders>
                   <w:shd w:fill="auto" w:val="clear"/>
                   <w:tcMar>
                     <w:top w:w="100.0" w:type="dxa"/>
@@ -760,64 +1717,19 @@
                   </w:pPr>
                   <w:r>
                     <w:rPr>
-                      <w:b w:val="1"/>
-                      <w:bCs w:val="1"/>
-                      <w:rtl w:val="0"/>
-                    </w:rPr>
-                    <w:t xml:space="preserve">STATUS</w:t>
-                  </w:r>
-                </w:p>
-              </w:tc>
-              <w:tc>
-                <w:tcPr>
-                  <w:shd w:fill="auto" w:val="clear"/>
-                  <w:tcMar>
-                    <w:top w:w="100.0" w:type="dxa"/>
-                    <w:left w:w="100.0" w:type="dxa"/>
-                    <w:bottom w:w="100.0" w:type="dxa"/>
-                    <w:right w:w="100.0" w:type="dxa"/>
-                  </w:tcMar>
-                  <w:vAlign w:val="top"/>
-                </w:tcPr>
-                <w:p>
-                  <w:pPr>
-                    <w:keepNext w:val="0"/>
-                    <w:keepLines w:val="0"/>
-                    <w:pageBreakBefore w:val="0"/>
-                    <w:widowControl w:val="0"/>
-                    <w:pBdr>
-                      <w:top w:space="0" w:sz="0" w:val="nil"/>
-                      <w:left w:space="0" w:sz="0" w:val="nil"/>
-                      <w:bottom w:space="0" w:sz="0" w:val="nil"/>
-                      <w:right w:space="0" w:sz="0" w:val="nil"/>
-                      <w:between w:space="0" w:sz="0" w:val="nil"/>
-                    </w:pBdr>
-                    <w:shd w:fill="auto" w:val="clear"/>
-                    <w:spacing w:after="0" w:before="0" w:line="240" w:lineRule="auto"/>
-                    <w:ind w:left="0" w:right="0" w:firstLine="0"/>
-                    <w:rPr>
-                      <w:b w:val="1"/>
-                      <w:bCs w:val="1"/>
-                    </w:rPr>
-                  </w:pPr>
-                  <w:r>
-                    <w:rPr>
-                      <w:b w:val="1"/>
-                      <w:bCs w:val="1"/>
-                      <w:rtl w:val="0"/>
-                    </w:rPr>
-                    <w:t xml:space="preserve">BALANCE</w:t>
-                  </w:r>
-                </w:p>
-              </w:tc>
-            </w:tr>
-            <w:tr>
-              <w:trPr>
-                <w:cantSplit w:val="0"/>
-                <w:tblHeader w:val="0"/>
-              </w:trPr>
-              <w:tc>
-                <w:tcPr>
+                      <w:rtl w:val="0"/>
+                    </w:rPr>
+                  </w:r>
+                </w:p>
+              </w:tc>
+              <w:tc>
+                <w:tcPr>
+                  <w:vMerge w:val="continue"/>
+                  <w:tcBorders>
+                    <w:left w:color="000000" w:space="0" w:sz="0" w:val="nil"/>
+                    <w:bottom w:color="000000" w:space="0" w:sz="0" w:val="nil"/>
+                    <w:right w:color="000000" w:space="0" w:sz="0" w:val="nil"/>
+                  </w:tcBorders>
                   <w:shd w:fill="auto" w:val="clear"/>
                   <w:tcMar>
                     <w:top w:w="100.0" w:type="dxa"/>
@@ -851,16 +1763,18 @@
                   </w:pPr>
                   <w:r>
                     <w:rPr>
-                      <w:b w:val="1"/>
-                      <w:bCs w:val="1"/>
-                      <w:rtl w:val="0"/>
-                    </w:rPr>
-                    <w:t xml:space="preserve">${statement_status}</w:t>
-                  </w:r>
-                </w:p>
-              </w:tc>
-              <w:tc>
-                <w:tcPr>
+                      <w:rtl w:val="0"/>
+                    </w:rPr>
+                  </w:r>
+                </w:p>
+              </w:tc>
+              <w:tc>
+                <w:tcPr>
+                  <w:vMerge w:val="continue"/>
+                  <w:tcBorders>
+                    <w:left w:color="000000" w:space="0" w:sz="0" w:val="nil"/>
+                    <w:bottom w:color="000000" w:space="0" w:sz="0" w:val="nil"/>
+                  </w:tcBorders>
                   <w:shd w:fill="auto" w:val="clear"/>
                   <w:tcMar>
                     <w:top w:w="100.0" w:type="dxa"/>
@@ -886,18 +1800,146 @@
                     <w:shd w:fill="auto" w:val="clear"/>
                     <w:spacing w:after="0" w:before="0" w:line="240" w:lineRule="auto"/>
                     <w:ind w:left="0" w:right="0" w:firstLine="0"/>
-                    <w:rPr>
-                      <w:b w:val="1"/>
-                      <w:bCs w:val="1"/>
-                    </w:rPr>
-                  </w:pPr>
-                  <w:r>
-                    <w:rPr>
-                      <w:b w:val="1"/>
-                      <w:bCs w:val="1"/>
-                      <w:rtl w:val="0"/>
-                    </w:rPr>
-                    <w:t xml:space="preserve">${statement_balance}</w:t>
+                    <w:jc w:val="left"/>
+                    <w:rPr>
+                      <w:b w:val="1"/>
+                      <w:bCs w:val="1"/>
+                    </w:rPr>
+                  </w:pPr>
+                  <w:r>
+                    <w:rPr>
+                      <w:rtl w:val="0"/>
+                    </w:rPr>
+                  </w:r>
+                </w:p>
+              </w:tc>
+            </w:tr>
+            <w:tr>
+              <w:trPr>
+                <w:cantSplit w:val="0"/>
+                <w:trHeight w:val="440" w:hRule="atLeast"/>
+                <w:tblHeader w:val="0"/>
+              </w:trPr>
+              <w:tc>
+                <w:tcPr>
+                  <w:gridSpan w:val="4"/>
+                  <w:tcBorders>
+                    <w:top w:color="000000" w:space="0" w:sz="0" w:val="nil"/>
+                  </w:tcBorders>
+                  <w:shd w:fill="auto" w:val="clear"/>
+                  <w:tcMar>
+                    <w:top w:w="100.0" w:type="dxa"/>
+                    <w:left w:w="100.0" w:type="dxa"/>
+                    <w:bottom w:w="100.0" w:type="dxa"/>
+                    <w:right w:w="100.0" w:type="dxa"/>
+                  </w:tcMar>
+                  <w:vAlign w:val="top"/>
+                </w:tcPr>
+                <w:p>
+                  <w:pPr>
+                    <w:widowControl w:val="0"/>
+                    <w:spacing w:after="0" w:line="360" w:lineRule="auto"/>
+                    <w:jc w:val="center"/>
+                    <w:rPr/>
+                  </w:pPr>
+                  <w:r>
+                    <w:rPr>
+                      <w:rtl w:val="0"/>
+                    </w:rPr>
+                    <w:t xml:space="preserve">Check enclosed in the amount of: __________________ (Payable to USCTDP Inc.)</w:t>
+                  </w:r>
+                </w:p>
+                <w:p>
+                  <w:pPr>
+                    <w:widowControl w:val="0"/>
+                    <w:spacing w:after="0" w:line="360" w:lineRule="auto"/>
+                    <w:jc w:val="center"/>
+                    <w:rPr/>
+                  </w:pPr>
+                  <w:r>
+                    <w:rPr>
+                      <w:rtl w:val="0"/>
+                    </w:rPr>
+                    <w:t xml:space="preserve">Or: Charge my credit card. We accept… Visa____ Master Card____  Discover____</w:t>
+                  </w:r>
+                </w:p>
+                <w:p>
+                  <w:pPr>
+                    <w:widowControl w:val="0"/>
+                    <w:spacing w:after="0" w:line="360" w:lineRule="auto"/>
+                    <w:jc w:val="center"/>
+                    <w:rPr/>
+                  </w:pPr>
+                  <w:r>
+                    <w:rPr>
+                      <w:rtl w:val="0"/>
+                    </w:rPr>
+                    <w:t xml:space="preserve">Account Number: _______________________________  Expiration Date: _______________</w:t>
+                  </w:r>
+                </w:p>
+                <w:p>
+                  <w:pPr>
+                    <w:widowControl w:val="0"/>
+                    <w:spacing w:after="0" w:line="360" w:lineRule="auto"/>
+                    <w:jc w:val="center"/>
+                    <w:rPr/>
+                  </w:pPr>
+                  <w:r>
+                    <w:rPr>
+                      <w:rtl w:val="0"/>
+                    </w:rPr>
+                    <w:t xml:space="preserve">Amount to Charge:______________  Signature:____________________________</w:t>
+                  </w:r>
+                </w:p>
+                <w:p>
+                  <w:pPr>
+                    <w:widowControl w:val="0"/>
+                    <w:spacing w:after="0" w:line="240" w:lineRule="auto"/>
+                    <w:jc w:val="center"/>
+                    <w:rPr>
+                      <w:b w:val="1"/>
+                      <w:bCs w:val="1"/>
+                    </w:rPr>
+                  </w:pPr>
+                  <w:r>
+                    <w:rPr>
+                      <w:b w:val="1"/>
+                      <w:bCs w:val="1"/>
+                      <w:rtl w:val="0"/>
+                    </w:rPr>
+                    <w:t xml:space="preserve">Please remit balance in full upon receipt to:</w:t>
+                  </w:r>
+                </w:p>
+                <w:p>
+                  <w:pPr>
+                    <w:widowControl w:val="0"/>
+                    <w:spacing w:after="0" w:line="240" w:lineRule="auto"/>
+                    <w:jc w:val="center"/>
+                    <w:rPr>
+                      <w:b w:val="1"/>
+                      <w:bCs w:val="1"/>
+                    </w:rPr>
+                  </w:pPr>
+                  <w:r>
+                    <w:rPr>
+                      <w:b w:val="1"/>
+                      <w:bCs w:val="1"/>
+                      <w:rtl w:val="0"/>
+                    </w:rPr>
+                    <w:t xml:space="preserve"> USCTDP Inc., </w:t>
+                  </w:r>
+                  <w:r>
+                    <w:rPr>
+                      <w:b w:val="1"/>
+                      <w:bCs w:val="1"/>
+                      <w:rtl w:val="0"/>
+                    </w:rPr>
+                    <w:t xml:space="preserve">37 McMurray Road, Building #1, Suite LL1, Pittsburgh, PA 15241</w:t>
+                  </w:r>
+                  <w:r>
+                    <w:rPr>
+                      <w:rtl w:val="0"/>
+                    </w:rPr>
                   </w:r>
                 </w:p>
               </w:tc>

</xml_diff>